<commit_message>
Update _NIEMOpen PGB Meeting Minutes 28 Aug  2025 v1 8-20-25.docx
</commit_message>
<xml_diff>
--- a/pgb-meeting-minutes/2025/4-dec-25/_NIEMOpen PGB Meeting Minutes 28 Aug  2025 v1 8-20-25.docx
+++ b/pgb-meeting-minutes/2025/4-dec-25/_NIEMOpen PGB Meeting Minutes 28 Aug  2025 v1 8-20-25.docx
@@ -12,6 +12,7 @@
           <w:szCs w:val="28"/>
         </w:rPr>
       </w:pPr>
+      <w:proofErr w:type="spellStart"/>
       <w:r>
         <w:rPr>
           <w:b/>
@@ -30,7 +31,18 @@
           <w:sz w:val="28"/>
           <w:szCs w:val="28"/>
         </w:rPr>
-        <w:t xml:space="preserve">IEMOpen Project Governing Board (PGB) </w:t>
+        <w:t>IEMOpen</w:t>
+      </w:r>
+      <w:proofErr w:type="spellEnd"/>
+      <w:r>
+        <w:rPr>
+          <w:b/>
+          <w:bCs/>
+          <w:color w:val="2F5496" w:themeColor="accent1" w:themeShade="BF"/>
+          <w:sz w:val="28"/>
+          <w:szCs w:val="28"/>
+        </w:rPr>
+        <w:t xml:space="preserve"> Project Governing Board (PGB) </w:t>
       </w:r>
       <w:r>
         <w:rPr>
@@ -218,7 +230,27 @@
           <w:shd w:val="clear" w:color="auto" w:fill="FFFFFF"/>
           <w:lang w:val="pt-BR"/>
         </w:rPr>
-        <w:t>Ms. Shunda Louis,</w:t>
+        <w:t xml:space="preserve">Ms. </w:t>
+      </w:r>
+      <w:proofErr w:type="spellStart"/>
+      <w:r>
+        <w:rPr>
+          <w:rFonts w:ascii="Calibri" w:hAnsi="Calibri" w:cs="Calibri"/>
+          <w:bdr w:val="none" w:sz="0" w:space="0" w:color="auto" w:frame="1"/>
+          <w:shd w:val="clear" w:color="auto" w:fill="FFFFFF"/>
+          <w:lang w:val="pt-BR"/>
+        </w:rPr>
+        <w:t>Shunda</w:t>
+      </w:r>
+      <w:proofErr w:type="spellEnd"/>
+      <w:r>
+        <w:rPr>
+          <w:rFonts w:ascii="Calibri" w:hAnsi="Calibri" w:cs="Calibri"/>
+          <w:bdr w:val="none" w:sz="0" w:space="0" w:color="auto" w:frame="1"/>
+          <w:shd w:val="clear" w:color="auto" w:fill="FFFFFF"/>
+          <w:lang w:val="pt-BR"/>
+        </w:rPr>
+        <w:t xml:space="preserve"> Louis,</w:t>
       </w:r>
       <w:r>
         <w:rPr>
@@ -1575,7 +1607,15 @@
         <w:spacing w:after="0" w:line="388" w:lineRule="exact"/>
       </w:pPr>
       <w:r>
-        <w:t>Motion to authorize $ 2000  for 8 October NPC Leadership Meeting.</w:t>
+        <w:t xml:space="preserve">Motion to authorize $ </w:t>
+      </w:r>
+      <w:proofErr w:type="gramStart"/>
+      <w:r>
+        <w:t>2000  for</w:t>
+      </w:r>
+      <w:proofErr w:type="gramEnd"/>
+      <w:r>
+        <w:t xml:space="preserve"> 8 October NPC Leadership Meeting.</w:t>
       </w:r>
     </w:p>
     <w:p>
@@ -1657,7 +1697,15 @@
         </w:numPr>
       </w:pPr>
       <w:r>
-        <w:t>2025 OASIS Staff / NIEMOpen Administrator</w:t>
+        <w:t xml:space="preserve">2025 OASIS Staff / </w:t>
+      </w:r>
+      <w:proofErr w:type="spellStart"/>
+      <w:r>
+        <w:t>NIEMOpen</w:t>
+      </w:r>
+      <w:proofErr w:type="spellEnd"/>
+      <w:r>
+        <w:t xml:space="preserve"> Administrator</w:t>
       </w:r>
     </w:p>
     <w:p>
@@ -1712,7 +1760,15 @@
         </w:numPr>
       </w:pPr>
       <w:r>
-        <w:t>8 Oct  NPC Meeting Update</w:t>
+        <w:t xml:space="preserve">8 </w:t>
+      </w:r>
+      <w:proofErr w:type="gramStart"/>
+      <w:r>
+        <w:t>Oct  NPC</w:t>
+      </w:r>
+      <w:proofErr w:type="gramEnd"/>
+      <w:r>
+        <w:t xml:space="preserve"> Meeting Update</w:t>
       </w:r>
     </w:p>
     <w:p>
@@ -2250,7 +2306,15 @@
               <w:t xml:space="preserve">000 for </w:t>
             </w:r>
             <w:r>
-              <w:t xml:space="preserve">Support Services for NIEMOpen </w:t>
+              <w:t xml:space="preserve">Support Services for </w:t>
+            </w:r>
+            <w:proofErr w:type="spellStart"/>
+            <w:r>
+              <w:t>NIEMOpen</w:t>
+            </w:r>
+            <w:proofErr w:type="spellEnd"/>
+            <w:r>
+              <w:t xml:space="preserve"> </w:t>
             </w:r>
             <w:r>
               <w:t xml:space="preserve">Leadership Meeting </w:t>
@@ -2272,10 +2336,34 @@
               <w:cnfStyle w:val="000000100000" w:firstRow="0" w:lastRow="0" w:firstColumn="0" w:lastColumn="0" w:oddVBand="0" w:evenVBand="0" w:oddHBand="1" w:evenHBand="0" w:firstRowFirstColumn="0" w:firstRowLastColumn="0" w:lastRowFirstColumn="0" w:lastRowLastColumn="0"/>
             </w:pPr>
             <w:r>
-              <w:t xml:space="preserve">(Paul-Wormeli) </w:t>
-            </w:r>
-            <w:r>
-              <w:t>I motion that  $ 2000 from the NIEMOpen general fund originally approved for the Reveal Summit be authorized for the October event and the remainder (~$4000) be returned to the general fund.</w:t>
+              <w:t>(Paul-</w:t>
+            </w:r>
+            <w:proofErr w:type="spellStart"/>
+            <w:r>
+              <w:t>Wormeli</w:t>
+            </w:r>
+            <w:proofErr w:type="spellEnd"/>
+            <w:r>
+              <w:t xml:space="preserve">) </w:t>
+            </w:r>
+            <w:r>
+              <w:t xml:space="preserve">I motion </w:t>
+            </w:r>
+            <w:proofErr w:type="gramStart"/>
+            <w:r>
+              <w:t>that  $</w:t>
+            </w:r>
+            <w:proofErr w:type="gramEnd"/>
+            <w:r>
+              <w:t xml:space="preserve"> 2000 from the </w:t>
+            </w:r>
+            <w:proofErr w:type="spellStart"/>
+            <w:r>
+              <w:t>NIEMOpen</w:t>
+            </w:r>
+            <w:proofErr w:type="spellEnd"/>
+            <w:r>
+              <w:t xml:space="preserve"> general fund originally approved for the Reveal Summit be authorized for the October event and the remainder (~$4000) be returned to the general fund.</w:t>
             </w:r>
           </w:p>
           <w:p>
@@ -2325,7 +2413,28 @@
               <w:cnfStyle w:val="000000100000" w:firstRow="0" w:lastRow="0" w:firstColumn="0" w:lastColumn="0" w:oddVBand="0" w:evenVBand="0" w:oddHBand="1" w:evenHBand="0" w:firstRowFirstColumn="0" w:firstRowLastColumn="0" w:lastRowFirstColumn="0" w:lastRowLastColumn="0"/>
             </w:pPr>
             <w:r>
-              <w:t>In May, the PGB approved $ 6000 from the  NIEMOpen general fund for refreshments, snacks, swag and AV services for the NIEMOpen Reveal now scheduled for 13 November as a Webinar.</w:t>
+              <w:t xml:space="preserve">In May, the PGB approved $ 6000 from </w:t>
+            </w:r>
+            <w:proofErr w:type="gramStart"/>
+            <w:r>
+              <w:t xml:space="preserve">the  </w:t>
+            </w:r>
+            <w:proofErr w:type="spellStart"/>
+            <w:r>
+              <w:t>NIEMOpen</w:t>
+            </w:r>
+            <w:proofErr w:type="spellEnd"/>
+            <w:proofErr w:type="gramEnd"/>
+            <w:r>
+              <w:t xml:space="preserve"> general fund for refreshments, snacks, swag and AV services for the </w:t>
+            </w:r>
+            <w:proofErr w:type="spellStart"/>
+            <w:r>
+              <w:t>NIEMOpen</w:t>
+            </w:r>
+            <w:proofErr w:type="spellEnd"/>
+            <w:r>
+              <w:t xml:space="preserve"> Reveal now scheduled for 13 November as a Webinar.</w:t>
             </w:r>
           </w:p>
           <w:p>
@@ -2346,8 +2455,13 @@
             <w:r>
               <w:t xml:space="preserve"> of October. The Reveal funds </w:t>
             </w:r>
-            <w:r>
-              <w:t>no longer required;</w:t>
+            <w:proofErr w:type="gramStart"/>
+            <w:r>
+              <w:t>no</w:t>
+            </w:r>
+            <w:proofErr w:type="gramEnd"/>
+            <w:r>
+              <w:t xml:space="preserve"> longer required;</w:t>
             </w:r>
             <w:r>
               <w:t xml:space="preserve"> </w:t>
@@ -2355,8 +2469,21 @@
             <w:r>
               <w:t xml:space="preserve">this motion </w:t>
             </w:r>
-            <w:r>
-              <w:t>request a portion of those funds (not to exceed $2K)  be applied to the 8 October NPC event</w:t>
+            <w:proofErr w:type="gramStart"/>
+            <w:r>
+              <w:t>request</w:t>
+            </w:r>
+            <w:proofErr w:type="gramEnd"/>
+            <w:r>
+              <w:t xml:space="preserve"> a portion of those funds (not to exceed $2</w:t>
+            </w:r>
+            <w:proofErr w:type="gramStart"/>
+            <w:r>
+              <w:t>K)  be</w:t>
+            </w:r>
+            <w:proofErr w:type="gramEnd"/>
+            <w:r>
+              <w:t xml:space="preserve"> applied to the 8 October NPC event</w:t>
             </w:r>
             <w:r>
               <w:t>.</w:t>
@@ -2404,7 +2531,19 @@
               <w:t>(</w:t>
             </w:r>
             <w:r>
-              <w:t>Paul-Wormeli-Chair</w:t>
+              <w:t>Paul-</w:t>
+            </w:r>
+            <w:proofErr w:type="spellStart"/>
+            <w:r>
+              <w:t>Wormeli</w:t>
+            </w:r>
+            <w:proofErr w:type="spellEnd"/>
+            <w:r>
+              <w:t>-</w:t>
+            </w:r>
+            <w:proofErr w:type="gramStart"/>
+            <w:r>
+              <w:t>Chair</w:t>
             </w:r>
             <w:r>
               <w:t>)</w:t>
@@ -2416,14 +2555,26 @@
               <w:t xml:space="preserve"> </w:t>
             </w:r>
             <w:r>
-              <w:t xml:space="preserve">Motion to </w:t>
+              <w:t>Motion</w:t>
+            </w:r>
+            <w:proofErr w:type="gramEnd"/>
+            <w:r>
+              <w:t xml:space="preserve"> to </w:t>
             </w:r>
             <w:r>
               <w:t xml:space="preserve">moving the 13 November 2025 PGB </w:t>
             </w:r>
             <w:r>
               <w:lastRenderedPageBreak/>
-              <w:t>meeting to 4 December 2025 and establish the CY 2026 Q 1, 2, 3 &amp; 4 PGB Meeting Dates was submitted as a readahead to PGB Voting Members.</w:t>
+              <w:t xml:space="preserve">meeting to 4 December 2025 and establish the CY 2026 Q 1, 2, 3 &amp; 4 PGB Meeting Dates </w:t>
+            </w:r>
+            <w:proofErr w:type="gramStart"/>
+            <w:r>
+              <w:t>was</w:t>
+            </w:r>
+            <w:proofErr w:type="gramEnd"/>
+            <w:r>
+              <w:t xml:space="preserve"> submitted as a readahead to PGB Voting Members.</w:t>
             </w:r>
           </w:p>
           <w:p>
@@ -2609,7 +2760,31 @@
         <w:t>Mr. Paul Wormeli</w:t>
       </w:r>
       <w:r>
-        <w:t>, newly elected PGB Chair outlined 2 alternative business model for NIEMOpen going forward</w:t>
+        <w:t xml:space="preserve">, newly elected PGB </w:t>
+      </w:r>
+      <w:proofErr w:type="gramStart"/>
+      <w:r>
+        <w:t>Chair</w:t>
+      </w:r>
+      <w:proofErr w:type="gramEnd"/>
+      <w:r>
+        <w:t xml:space="preserve"> outlined 2 alternative business </w:t>
+      </w:r>
+      <w:proofErr w:type="gramStart"/>
+      <w:r>
+        <w:t>model</w:t>
+      </w:r>
+      <w:proofErr w:type="gramEnd"/>
+      <w:r>
+        <w:t xml:space="preserve"> for </w:t>
+      </w:r>
+      <w:proofErr w:type="spellStart"/>
+      <w:r>
+        <w:t>NIEMOpen</w:t>
+      </w:r>
+      <w:proofErr w:type="spellEnd"/>
+      <w:r>
+        <w:t xml:space="preserve"> going forward</w:t>
       </w:r>
       <w:r>
         <w:t xml:space="preserve"> describing the challenges and opportunities of each.</w:t>
@@ -2699,7 +2874,15 @@
         </w:numPr>
       </w:pPr>
       <w:r>
-        <w:t xml:space="preserve">(Approved) NIEMOpen PGB Meeting Minutes </w:t>
+        <w:t xml:space="preserve">(Approved) </w:t>
+      </w:r>
+      <w:proofErr w:type="spellStart"/>
+      <w:r>
+        <w:t>NIEMOpen</w:t>
+      </w:r>
+      <w:proofErr w:type="spellEnd"/>
+      <w:r>
+        <w:t xml:space="preserve"> PGB Meeting Minutes </w:t>
       </w:r>
       <w:r>
         <w:t xml:space="preserve">29 May </w:t>
@@ -2731,13 +2914,21 @@
           <w:b/>
           <w:bCs/>
         </w:rPr>
-        <w:t>Approval:</w:t>
-      </w:r>
+        <w:t>Approval</w:t>
+      </w:r>
+      <w:proofErr w:type="gramStart"/>
       <w:r>
         <w:rPr>
           <w:b/>
           <w:bCs/>
         </w:rPr>
+        <w:t>:</w:t>
+      </w:r>
+      <w:r>
+        <w:rPr>
+          <w:b/>
+          <w:bCs/>
+        </w:rPr>
         <w:t xml:space="preserve"> </w:t>
       </w:r>
       <w:r>
@@ -2749,6 +2940,7 @@
       <w:r>
         <w:t>8</w:t>
       </w:r>
+      <w:proofErr w:type="gramEnd"/>
       <w:r>
         <w:t xml:space="preserve"> </w:t>
       </w:r>

</xml_diff>